<commit_message>
Regenerate ACME .docx and .pptx with Microsoft brand references removed
</commit_message>
<xml_diff>
--- a/samples/gtm-plan-acme-insight-studio.docx
+++ b/samples/gtm-plan-acme-insight-studio.docx
@@ -544,7 +544,7 @@
                 <w:color w:val="2D2D2D"/>
                 <w:sz w:val="18"/>
               </w:rPr>
-              <w:t>~45,000 E5 orgs</w:t>
+              <w:t>~45,000 Enterprise tier orgs</w:t>
             </w:r>
           </w:p>
         </w:tc>
@@ -698,7 +698,7 @@
                 <w:color w:val="2D2D2D"/>
                 <w:sz w:val="18"/>
               </w:rPr>
-              <w:t>Already deployed where users work (Outlook, Teams, Word)</w:t>
+              <w:t>Already deployed where users work (email, chat, docs)</w:t>
             </w:r>
           </w:p>
         </w:tc>
@@ -768,7 +768,7 @@
                 <w:color w:val="2D2D2D"/>
                 <w:sz w:val="18"/>
               </w:rPr>
-              <w:t>10x faster to production with pre-built connectors and Copilot Studio</w:t>
+              <w:t>10x faster to production with pre-built connectors and ACME Studio</w:t>
             </w:r>
           </w:p>
         </w:tc>
@@ -854,7 +854,7 @@
           <w:color w:val="2D2D2D"/>
           <w:sz w:val="19"/>
         </w:rPr>
-        <w:t xml:space="preserve"> Native Graph API, enterprise security, Copilot Studio low-code, marketplace distribution</w:t>
+        <w:t xml:space="preserve"> Native Graph API, enterprise security, ACME Studio low-code, marketplace distribution</w:t>
       </w:r>
     </w:p>
     <w:p>
@@ -1615,7 +1615,7 @@
                 <w:color w:val="2D2D2D"/>
                 <w:sz w:val="18"/>
               </w:rPr>
-              <w:t>$10M partner incentive fund + Copilot Studio low-code path</w:t>
+              <w:t>$10M partner incentive fund + ACME Studio low-code path</w:t>
             </w:r>
           </w:p>
         </w:tc>

</xml_diff>

<commit_message>
samples: genericize ACME GTM plan to remove M365 Copilot extensibility terminology
The ACME Insight Studio sample (and the brief/deck generator scripts) still
contained M365 Copilot extensibility-specific phrasing: 'declarative agents',
'API plugins', 'Graph connectors', 'adaptive UI cards', 'conversation extensions',
'200M+ commercial user base', 'ACME Graph API/access', 'Extensibility Opportunity',
and a '15% of Copilot deals' metric. Replace with generic platform-integration
language (AI agents, REST integrations, data connectors, embedded UI components,
in-app chat surfaces, ACME Platform API, 20M+ users, ACME platform deals) so
the sample reads as a generic enterprise AI-platform GTM plan, not a thinly
veiled M365 Copilot extensibility plan. Regenerated the .docx and .pptx from
the updated scripts; PNG previews are stale and will need a re-render on a
Windows + Office host (scripts/render_sample_previews.py).
</commit_message>
<xml_diff>
--- a/samples/gtm-plan-acme-insight-studio.docx
+++ b/samples/gtm-plan-acme-insight-studio.docx
@@ -204,7 +204,7 @@
           <w:color w:val="2D2D2D"/>
           <w:sz w:val="20"/>
         </w:rPr>
-        <w:t>For enterprise developers and ISV partners who need to extend AI capabilities within the tools their users already live in, ACME Insight Studio is the only platform that provides native integration with the ACME Graph API, security model, and 200M+ commercial user base, enabling AI-powered workflows that ship in days rather than months.</w:t>
+        <w:t>For enterprise developers and ISV partners who need to extend AI capabilities within the tools their users already live in, ACME Insight Studio is the only platform that provides native integration with the ACME Cloud Platform API, security model, and 20M+ commercial user base, enabling AI-powered workflows that ship in days rather than months.</w:t>
       </w:r>
     </w:p>
     <w:p>
@@ -662,7 +662,7 @@
                 <w:color w:val="2D2D2D"/>
                 <w:sz w:val="18"/>
               </w:rPr>
-              <w:t>Native ACME Graph access, enterprise identity, compliance built in</w:t>
+              <w:t>Native ACME Platform access, enterprise identity, compliance built in</w:t>
             </w:r>
           </w:p>
         </w:tc>
@@ -831,7 +831,7 @@
           <w:color w:val="2D2D2D"/>
           <w:sz w:val="19"/>
         </w:rPr>
-        <w:t xml:space="preserve"> Ship AI agents that reach 200M+ users through the apps they use every day</w:t>
+        <w:t xml:space="preserve"> Ship AI agents that reach 20M+ users through the apps they use every day</w:t>
       </w:r>
     </w:p>
     <w:p>
@@ -854,7 +854,7 @@
           <w:color w:val="2D2D2D"/>
           <w:sz w:val="19"/>
         </w:rPr>
-        <w:t xml:space="preserve"> Native Graph API, enterprise security, ACME Studio low-code, marketplace distribution</w:t>
+        <w:t xml:space="preserve"> Native ACME Platform API, enterprise security, ACME Studio low-code, marketplace distribution</w:t>
       </w:r>
     </w:p>
     <w:p>
@@ -877,7 +877,7 @@
           <w:color w:val="2D2D2D"/>
           <w:sz w:val="19"/>
         </w:rPr>
-        <w:t xml:space="preserve"> Declarative agents, API plugins, Graph connectors, Adaptive Cards</w:t>
+        <w:t xml:space="preserve"> AI agents, REST integrations, data connectors, embedded UI components</w:t>
       </w:r>
     </w:p>
     <w:p>
@@ -962,7 +962,7 @@
           <w:color w:val="2D2D2D"/>
           <w:sz w:val="19"/>
         </w:rPr>
-        <w:t xml:space="preserve"> $12B AI extensibility and integration platform segment</w:t>
+        <w:t xml:space="preserve"> $12B AI platform and integration segment</w:t>
       </w:r>
     </w:p>
     <w:p>
@@ -1027,7 +1027,7 @@
           <w:color w:val="2D2D2D"/>
           <w:sz w:val="19"/>
         </w:rPr>
-        <w:t>Competitors are 6-12 months behind on enterprise-grade extensibility frameworks</w:t>
+        <w:t>Competitors are 6-12 months behind on enterprise-grade platform integration frameworks</w:t>
       </w:r>
     </w:p>
     <w:p>
@@ -1230,7 +1230,7 @@
                 <w:color w:val="2D2D2D"/>
                 <w:sz w:val="18"/>
               </w:rPr>
-              <w:t>Enterprise security, ACME Graph, compliance</w:t>
+              <w:t>Enterprise security, ACME Platform, compliance</w:t>
             </w:r>
           </w:p>
         </w:tc>
@@ -1668,7 +1668,7 @@
                 <w:color w:val="2D2D2D"/>
                 <w:sz w:val="18"/>
               </w:rPr>
-              <w:t>Leverage ACME Graph lock-in and compliance certifications</w:t>
+              <w:t>Leverage ACME Platform lock-in and compliance certifications</w:t>
             </w:r>
           </w:p>
         </w:tc>
@@ -2600,7 +2600,7 @@
                 <w:color w:val="2D2D2D"/>
                 <w:sz w:val="18"/>
               </w:rPr>
-              <w:t>15% of Copilot deals</w:t>
+              <w:t>15% of ACME platform deals</w:t>
             </w:r>
           </w:p>
         </w:tc>

</xml_diff>